<commit_message>
Agregando modelos de adenda y contratos actualizados
</commit_message>
<xml_diff>
--- a/backend/templates/MODELO DE ADENDA A CONTRATO POR AUMENTO DE REMUNERACIÓN.docx
+++ b/backend/templates/MODELO DE ADENDA A CONTRATO POR AUMENTO DE REMUNERACIÓN.docx
@@ -685,16 +685,6 @@
           <w:color w:val="000000"/>
           <w:sz w:val="24"/>
           <w:szCs w:val="24"/>
-          <w:lang w:eastAsia="es-ES"/>
-        </w:rPr>
-        <w:t>a</w:t>
-      </w:r>
-      <w:r>
-        <w:rPr>
-          <w:rFonts w:ascii="Arial" w:eastAsia="Times New Roman" w:hAnsi="Arial" w:cs="Arial"/>
-          <w:color w:val="000000"/>
-          <w:sz w:val="24"/>
-          <w:szCs w:val="24"/>
           <w:lang w:val="es-ES" w:eastAsia="es-ES"/>
         </w:rPr>
         <w:t>, d</w:t>
@@ -719,6 +709,7 @@
         </w:rPr>
         <w:t xml:space="preserve">de </w:t>
       </w:r>
+      <w:bookmarkStart w:id="0" w:name="_Hlk225497458"/>
       <w:r>
         <w:rPr>
           <w:rFonts w:ascii="Arial" w:eastAsia="Times New Roman" w:hAnsi="Arial" w:cs="Arial"/>
@@ -729,6 +720,7 @@
         </w:rPr>
         <w:t>{distrito}</w:t>
       </w:r>
+      <w:bookmarkEnd w:id="0"/>
       <w:r>
         <w:rPr>
           <w:rFonts w:ascii="Arial" w:eastAsia="Times New Roman" w:hAnsi="Arial" w:cs="Arial"/>
@@ -739,6 +731,7 @@
         </w:rPr>
         <w:t xml:space="preserve">, provincia y departamento de </w:t>
       </w:r>
+      <w:bookmarkStart w:id="1" w:name="_Hlk225497719"/>
       <w:r>
         <w:rPr>
           <w:rFonts w:ascii="Arial" w:eastAsia="Times New Roman" w:hAnsi="Arial" w:cs="Arial"/>
@@ -771,6 +764,7 @@
         </w:rPr>
         <w:t>}</w:t>
       </w:r>
+      <w:bookmarkEnd w:id="1"/>
       <w:r>
         <w:rPr>
           <w:rFonts w:ascii="Arial" w:eastAsia="Times New Roman" w:hAnsi="Arial" w:cs="Arial"/>
@@ -879,6 +873,7 @@
         </w:rPr>
         <w:t xml:space="preserve"> </w:t>
       </w:r>
+      <w:bookmarkStart w:id="2" w:name="_Hlk225499489"/>
       <w:r>
         <w:rPr>
           <w:rFonts w:ascii="Arial" w:eastAsia="Times New Roman" w:hAnsi="Arial" w:cs="Arial"/>
@@ -921,6 +916,7 @@
         </w:rPr>
         <w:t>}</w:t>
       </w:r>
+      <w:bookmarkEnd w:id="2"/>
       <w:r>
         <w:rPr>
           <w:rFonts w:ascii="Arial" w:eastAsia="Times New Roman" w:hAnsi="Arial" w:cs="Arial"/>
@@ -931,6 +927,7 @@
         </w:rPr>
         <w:t xml:space="preserve"> de </w:t>
       </w:r>
+      <w:bookmarkStart w:id="3" w:name="_Hlk225499502"/>
       <w:r>
         <w:rPr>
           <w:rFonts w:ascii="Arial" w:eastAsia="Times New Roman" w:hAnsi="Arial" w:cs="Arial"/>
@@ -961,8 +958,9 @@
           <w:szCs w:val="24"/>
           <w:lang w:eastAsia="es-PE"/>
         </w:rPr>
-        <w:t xml:space="preserve">} </w:t>
-      </w:r>
+        <w:t>}</w:t>
+      </w:r>
+      <w:bookmarkEnd w:id="3"/>
       <w:r>
         <w:rPr>
           <w:rFonts w:ascii="Arial" w:eastAsia="Times New Roman" w:hAnsi="Arial" w:cs="Arial"/>
@@ -971,6 +969,16 @@
           <w:szCs w:val="24"/>
           <w:lang w:eastAsia="es-PE"/>
         </w:rPr>
+        <w:t xml:space="preserve"> </w:t>
+      </w:r>
+      <w:r>
+        <w:rPr>
+          <w:rFonts w:ascii="Arial" w:eastAsia="Times New Roman" w:hAnsi="Arial" w:cs="Arial"/>
+          <w:color w:val="000000"/>
+          <w:sz w:val="24"/>
+          <w:szCs w:val="24"/>
+          <w:lang w:eastAsia="es-PE"/>
+        </w:rPr>
         <w:t>del</w:t>
       </w:r>
       <w:r>
@@ -983,6 +991,7 @@
         </w:rPr>
         <w:t xml:space="preserve"> </w:t>
       </w:r>
+      <w:bookmarkStart w:id="4" w:name="_Hlk225499767"/>
       <w:r>
         <w:rPr>
           <w:rFonts w:ascii="Arial" w:eastAsia="Times New Roman" w:hAnsi="Arial" w:cs="Arial"/>
@@ -1045,6 +1054,7 @@
         </w:rPr>
         <w:t xml:space="preserve"> </w:t>
       </w:r>
+      <w:bookmarkEnd w:id="4"/>
       <w:r>
         <w:rPr>
           <w:rFonts w:ascii="Arial" w:eastAsia="Times New Roman" w:hAnsi="Arial" w:cs="Arial"/>
@@ -1220,6 +1230,7 @@
         </w:rPr>
         <w:t xml:space="preserve"> para el cargo de </w:t>
       </w:r>
+      <w:bookmarkStart w:id="5" w:name="_Hlk225499801"/>
       <w:r>
         <w:rPr>
           <w:rFonts w:ascii="Arial" w:eastAsia="Times New Roman" w:hAnsi="Arial" w:cs="Arial"/>
@@ -1244,6 +1255,7 @@
         </w:rPr>
         <w:t>.</w:t>
       </w:r>
+      <w:bookmarkEnd w:id="5"/>
     </w:p>
     <w:p>
       <w:pPr>
@@ -1699,6 +1711,7 @@
         </w:rPr>
         <w:t xml:space="preserve"> </w:t>
       </w:r>
+      <w:bookmarkStart w:id="6" w:name="_Hlk225499998"/>
       <w:r>
         <w:rPr>
           <w:rFonts w:ascii="Arial" w:hAnsi="Arial" w:cs="Arial"/>
@@ -1773,6 +1786,7 @@
         </w:rPr>
         <w:t>{año que se genera}</w:t>
       </w:r>
+      <w:bookmarkEnd w:id="6"/>
       <w:r>
         <w:rPr>
           <w:rFonts w:ascii="Arial" w:hAnsi="Arial" w:cs="Arial"/>

</xml_diff>